<commit_message>
Fecha o e-book: remove pendências do autor sem resposta
Co-Authored-By: Claude Opus 5.5 <noreply@anthropic.com>
Claude-Session: https://claude.ai/code/session_01GJhkYfDrHd3AkmDKDTo71F
</commit_message>
<xml_diff>
--- a/curso/dist/Pendencias-do-Autor.docx
+++ b/curso/dist/Pendencias-do-Autor.docx
@@ -89,16 +89,16 @@
         <w:pStyle w:val="FirstParagraph"/>
       </w:pPr>
       <w:r>
-        <w:t xml:space="preserve">Responda no seu ritmo. O que você não quiser ou não puder mandar, eu tiro do e-book, sem deixar buraco.</w:t>
-      </w:r>
-    </w:p>
-    <w:bookmarkStart w:id="20" w:name="sua-história-carta-ao-leitor-e-cap.-7.13"/>
+        <w:t xml:space="preserve">O e-book está fechado e pode ser publicado. O que você não mandou saiu do texto, sem deixar buraco.</w:t>
+      </w:r>
+    </w:p>
+    <w:bookmarkStart w:id="20" w:name="obrigatório-antes-de-vender"/>
     <w:p>
       <w:pPr>
         <w:pStyle w:val="Heading1"/>
       </w:pPr>
       <w:r>
-        <w:t xml:space="preserve">1. Sua história (Carta ao leitor e cap. 7.13)</w:t>
+        <w:t xml:space="preserve">Obrigatório antes de vender</w:t>
       </w:r>
     </w:p>
     <w:p>
@@ -111,15 +111,34 @@
       </w:pPr>
       <w:r>
         <w:rPr>
-          <w:strike/>
+          <w:bCs/>
+          <w:b/>
         </w:rPr>
-        <w:t xml:space="preserve">Por que você saiu do Brasil?</w:t>
+        <w:t xml:space="preserve">Link do grupo VIP do WhatsApp:</w:t>
       </w:r>
       <w:r>
         <w:t xml:space="preserve"> </w:t>
       </w:r>
       <w:r>
-        <w:t xml:space="preserve">Recebido (29/10/2026) e já no e-book.</w:t>
+        <w:t xml:space="preserve">vira o QR code da página</w:t>
+      </w:r>
+      <w:r>
+        <w:t xml:space="preserve"> </w:t>
+      </w:r>
+      <w:r>
+        <w:t xml:space="preserve">“</w:t>
+      </w:r>
+      <w:r>
+        <w:t xml:space="preserve">Grupo VIP</w:t>
+      </w:r>
+      <w:r>
+        <w:t xml:space="preserve">”</w:t>
+      </w:r>
+      <w:r>
+        <w:t xml:space="preserve"> </w:t>
+      </w:r>
+      <w:r>
+        <w:t xml:space="preserve">(hoje é um quadro tracejado).</w:t>
       </w:r>
     </w:p>
     <w:p>
@@ -131,7 +150,17 @@
         <w:pStyle w:val="Compact"/>
       </w:pPr>
       <w:r>
-        <w:t xml:space="preserve">Há quanto tempo mora na Bolívia? (opcional)</w:t>
+        <w:rPr>
+          <w:bCs/>
+          <w:b/>
+        </w:rPr>
+        <w:t xml:space="preserve">Link da página de vendas ou do checkout:</w:t>
+      </w:r>
+      <w:r>
+        <w:t xml:space="preserve"> </w:t>
+      </w:r>
+      <w:r>
+        <w:t xml:space="preserve">entra no Dossiê (página de WhatsApp e contracapa) e nos botões da página de vendas.</w:t>
       </w:r>
     </w:p>
     <w:p>
@@ -143,17 +172,46 @@
         <w:pStyle w:val="Compact"/>
       </w:pPr>
       <w:r>
-        <w:t xml:space="preserve">Para completar o depoimento (opcional): o que mais te surpreendeu, o que foi difícil e o que você faria diferente.</w:t>
+        <w:rPr>
+          <w:bCs/>
+          <w:b/>
+        </w:rPr>
+        <w:t xml:space="preserve">Preço do Dossiê avulso</w:t>
+      </w:r>
+      <w:r>
+        <w:t xml:space="preserve">, ou se vai ser grátis para captar contatos.</w:t>
+      </w:r>
+    </w:p>
+    <w:p>
+      <w:pPr>
+        <w:numPr>
+          <w:ilvl w:val="0"/>
+          <w:numId w:val="1001"/>
+        </w:numPr>
+        <w:pStyle w:val="Compact"/>
+      </w:pPr>
+      <w:r>
+        <w:rPr>
+          <w:bCs/>
+          <w:b/>
+        </w:rPr>
+        <w:t xml:space="preserve">Abrir os 19 links do Dossiê</w:t>
+      </w:r>
+      <w:r>
+        <w:t xml:space="preserve"> </w:t>
+      </w:r>
+      <w:r>
+        <w:t xml:space="preserve">e avisar se algum não abrir.</w:t>
       </w:r>
     </w:p>
     <w:bookmarkEnd w:id="20"/>
-    <w:bookmarkStart w:id="21" w:name="X4d2177a2e6a4baaa1df6d6978f4d0738aeb05ed"/>
+    <w:bookmarkStart w:id="21" w:name="Xc718446c34a81582c892764d655ad24b91b5214"/>
     <w:p>
       <w:pPr>
         <w:pStyle w:val="Heading1"/>
       </w:pPr>
       <w:r>
-        <w:t xml:space="preserve">2. Moradia e custo de vida em Cochabamba (Parte 2)</w:t>
+        <w:t xml:space="preserve">Opcional (deixa o livro mais forte; cada item volta para o capítulo indicado)</w:t>
       </w:r>
     </w:p>
     <w:p>
@@ -165,7 +223,7 @@
         <w:pStyle w:val="Compact"/>
       </w:pPr>
       <w:r>
-        <w:t xml:space="preserve">Foto do contrato ou do recibo do aluguel, com nome, documento e endereço borrados.</w:t>
+        <w:t xml:space="preserve">Há quanto tempo mora na Bolívia; o que surpreendeu, o que foi difícil, o que faria diferente (7.13).</w:t>
       </w:r>
     </w:p>
     <w:p>
@@ -177,7 +235,7 @@
         <w:pStyle w:val="Compact"/>
       </w:pPr>
       <w:r>
-        <w:t xml:space="preserve">3 anúncios reais de imóvel à venda: cidade, bairro, m² e preço.</w:t>
+        <w:t xml:space="preserve">Foto do contrato ou recibo do aluguel, com dados borrados (2.5).</w:t>
       </w:r>
     </w:p>
     <w:p>
@@ -189,7 +247,7 @@
         <w:pStyle w:val="Compact"/>
       </w:pPr>
       <w:r>
-        <w:t xml:space="preserve">Mais 2 anúncios de aluguel: bairro, quartos e preço em Bs.</w:t>
+        <w:t xml:space="preserve">Anúncios reais de imóveis à venda e de aluguel (2.2 e 2.3).</w:t>
       </w:r>
     </w:p>
     <w:p>
@@ -201,7 +259,7 @@
         <w:pStyle w:val="Compact"/>
       </w:pPr>
       <w:r>
-        <w:t xml:space="preserve">Quanto você gasta por mês com mercado.</w:t>
+        <w:t xml:space="preserve">5 pares de anúncios de carro Brasil × Bolívia (2.4; hoje é uma tabela para o leitor preencher).</w:t>
       </w:r>
     </w:p>
     <w:p>
@@ -213,7 +271,7 @@
         <w:pStyle w:val="Compact"/>
       </w:pPr>
       <w:r>
-        <w:t xml:space="preserve">Quanto você paga de contas (luz, água, internet).</w:t>
+        <w:t xml:space="preserve">Gastos com academia e cinema; orçamento de família com 2 filhos (2.5 e 2.8).</w:t>
       </w:r>
     </w:p>
     <w:p>
@@ -225,7 +283,7 @@
         <w:pStyle w:val="Compact"/>
       </w:pPr>
       <w:r>
-        <w:t xml:space="preserve">Preço de academia e de cinema.</w:t>
+        <w:t xml:space="preserve">Clínicas em Cochabamba; preço de consulta, exames e seguro (2.6).</w:t>
       </w:r>
     </w:p>
     <w:p>
@@ -237,274 +295,85 @@
         <w:pStyle w:val="Compact"/>
       </w:pPr>
       <w:r>
-        <w:t xml:space="preserve">Se souber: orçamento de uma família com 2 filhos na sua cidade.</w:t>
-      </w:r>
-    </w:p>
-    <w:bookmarkEnd w:id="21"/>
-    <w:bookmarkStart w:id="22" w:name="carros-cap.-2.4"/>
-    <w:p>
-      <w:pPr>
-        <w:pStyle w:val="Heading1"/>
-      </w:pPr>
-      <w:r>
-        <w:t xml:space="preserve">3. Carros (cap. 2.4)</w:t>
+        <w:t xml:space="preserve">Mensalidade de 2 ou 3 escolas (2.7).</w:t>
       </w:r>
     </w:p>
     <w:p>
       <w:pPr>
         <w:numPr>
           <w:ilvl w:val="0"/>
-          <w:numId w:val="1003"/>
+          <w:numId w:val="1002"/>
         </w:numPr>
         <w:pStyle w:val="Compact"/>
       </w:pPr>
       <w:r>
-        <w:t xml:space="preserve">5 pares de anúncios do mesmo modelo e ano no Brasil e na Bolívia: 1 SUV, 1 sedã, 1 picape, 1 moto e 1 carro de luxo. Basta o print ou o link de cada um.</w:t>
-      </w:r>
-    </w:p>
-    <w:bookmarkEnd w:id="22"/>
-    <w:bookmarkStart w:id="23" w:name="saúde-e-escola-caps.-2.6-e-2.7"/>
-    <w:p>
-      <w:pPr>
-        <w:pStyle w:val="Heading1"/>
-      </w:pPr>
-      <w:r>
-        <w:t xml:space="preserve">4. Saúde e escola (caps. 2.6 e 2.7)</w:t>
+        <w:t xml:space="preserve">Rede que você usa para o USDT; exchange no Brasil, P2P na Bolívia e banco (3.5 e 4.5).</w:t>
       </w:r>
     </w:p>
     <w:p>
       <w:pPr>
         <w:numPr>
           <w:ilvl w:val="0"/>
-          <w:numId w:val="1004"/>
+          <w:numId w:val="1002"/>
         </w:numPr>
         <w:pStyle w:val="Compact"/>
       </w:pPr>
       <w:r>
-        <w:t xml:space="preserve">Clínicas de referência em Cochabamba.</w:t>
+        <w:t xml:space="preserve">Seu resultado com câmbio, com extratos borrados (volta a página</w:t>
+      </w:r>
+      <w:r>
+        <w:t xml:space="preserve"> </w:t>
+      </w:r>
+      <w:r>
+        <w:t xml:space="preserve">“</w:t>
+      </w:r>
+      <w:r>
+        <w:t xml:space="preserve">Como eu ganho com câmbio</w:t>
+      </w:r>
+      <w:r>
+        <w:t xml:space="preserve">”</w:t>
+      </w:r>
+      <w:r>
+        <w:t xml:space="preserve">, 4.18).</w:t>
       </w:r>
     </w:p>
     <w:p>
       <w:pPr>
         <w:numPr>
           <w:ilvl w:val="0"/>
-          <w:numId w:val="1004"/>
+          <w:numId w:val="1002"/>
         </w:numPr>
         <w:pStyle w:val="Compact"/>
       </w:pPr>
       <w:r>
-        <w:t xml:space="preserve">Quanto você pagou de consulta, exames e seguro saúde.</w:t>
+        <w:t xml:space="preserve">Como foi a sua residência e a abertura de conta (7.4 e 7.7).</w:t>
       </w:r>
     </w:p>
     <w:p>
       <w:pPr>
         <w:numPr>
           <w:ilvl w:val="0"/>
-          <w:numId w:val="1004"/>
+          <w:numId w:val="1002"/>
         </w:numPr>
         <w:pStyle w:val="Compact"/>
       </w:pPr>
       <w:r>
-        <w:t xml:space="preserve">Mensalidade de 2 ou 3 escolas (nome da escola e valor).</w:t>
-      </w:r>
-    </w:p>
-    <w:bookmarkEnd w:id="23"/>
-    <w:bookmarkStart w:id="24" w:name="o-método-na-prática-partes-3-e-4"/>
-    <w:p>
-      <w:pPr>
-        <w:pStyle w:val="Heading1"/>
-      </w:pPr>
-      <w:r>
-        <w:t xml:space="preserve">5. O método na prática (Partes 3 e 4)</w:t>
+        <w:t xml:space="preserve">Grupos e igrejas de brasileiros em Cochabamba (7.12).</w:t>
       </w:r>
     </w:p>
     <w:p>
       <w:pPr>
         <w:numPr>
           <w:ilvl w:val="0"/>
-          <w:numId w:val="1005"/>
+          <w:numId w:val="1002"/>
         </w:numPr>
         <w:pStyle w:val="Compact"/>
       </w:pPr>
       <w:r>
-        <w:t xml:space="preserve">Qual rede você usa para mandar USDT (ex.: TRON, Polygon) e o caminho do dia a dia.</w:t>
-      </w:r>
-    </w:p>
-    <w:p>
-      <w:pPr>
-        <w:numPr>
-          <w:ilvl w:val="0"/>
-          <w:numId w:val="1005"/>
-        </w:numPr>
-        <w:pStyle w:val="Compact"/>
-      </w:pPr>
-      <w:r>
-        <w:t xml:space="preserve">Qual exchange você usa no Brasil, qual exchange ou P2P na Bolívia e qual banco.</w:t>
-      </w:r>
-    </w:p>
-    <w:p>
-      <w:pPr>
-        <w:numPr>
-          <w:ilvl w:val="0"/>
-          <w:numId w:val="1005"/>
-        </w:numPr>
-        <w:pStyle w:val="Compact"/>
-      </w:pPr>
-      <w:r>
-        <w:t xml:space="preserve">Seu resultado com câmbio (cap. 4.18): período, capital usado, margem média por operação, horas por semana, melhor e pior mês.</w:t>
-      </w:r>
-    </w:p>
-    <w:p>
-      <w:pPr>
-        <w:numPr>
-          <w:ilvl w:val="0"/>
-          <w:numId w:val="1005"/>
-        </w:numPr>
-        <w:pStyle w:val="Compact"/>
-      </w:pPr>
-      <w:r>
-        <w:t xml:space="preserve">Extratos desse período, com dados pessoais, números de conta e nomes de terceiros borrados.</w:t>
-      </w:r>
-    </w:p>
-    <w:bookmarkEnd w:id="24"/>
-    <w:bookmarkStart w:id="25" w:name="documentos-e-comunidade-parte-7"/>
-    <w:p>
-      <w:pPr>
-        <w:pStyle w:val="Heading1"/>
-      </w:pPr>
-      <w:r>
-        <w:t xml:space="preserve">6. Documentos e comunidade (Parte 7)</w:t>
-      </w:r>
-    </w:p>
-    <w:p>
-      <w:pPr>
-        <w:numPr>
-          <w:ilvl w:val="0"/>
-          <w:numId w:val="1006"/>
-        </w:numPr>
-        <w:pStyle w:val="Compact"/>
-      </w:pPr>
-      <w:r>
-        <w:t xml:space="preserve">Como foi a sua residência em Cochabamba: quanto tempo levou, quanto pagou e quais documentos pediram.</w:t>
-      </w:r>
-    </w:p>
-    <w:p>
-      <w:pPr>
-        <w:numPr>
-          <w:ilvl w:val="0"/>
-          <w:numId w:val="1006"/>
-        </w:numPr>
-        <w:pStyle w:val="Compact"/>
-      </w:pPr>
-      <w:r>
-        <w:t xml:space="preserve">Em qual banco você abriu conta e o que pediram.</w:t>
-      </w:r>
-    </w:p>
-    <w:p>
-      <w:pPr>
-        <w:numPr>
-          <w:ilvl w:val="0"/>
-          <w:numId w:val="1006"/>
-        </w:numPr>
-        <w:pStyle w:val="Compact"/>
-      </w:pPr>
-      <w:r>
-        <w:t xml:space="preserve">Grupos e igrejas de brasileiros que você conhece em Cochabamba.</w:t>
-      </w:r>
-    </w:p>
-    <w:bookmarkEnd w:id="25"/>
-    <w:bookmarkStart w:id="26" w:name="links-e-decisões-de-venda"/>
-    <w:p>
-      <w:pPr>
-        <w:pStyle w:val="Heading1"/>
-      </w:pPr>
-      <w:r>
-        <w:t xml:space="preserve">7. Links e decisões de venda</w:t>
-      </w:r>
-    </w:p>
-    <w:p>
-      <w:pPr>
-        <w:numPr>
-          <w:ilvl w:val="0"/>
-          <w:numId w:val="1007"/>
-        </w:numPr>
-        <w:pStyle w:val="Compact"/>
-      </w:pPr>
-      <w:r>
-        <w:t xml:space="preserve">Link do checkout (Hotmart, Kiwify, Eduzz…).</w:t>
-      </w:r>
-    </w:p>
-    <w:p>
-      <w:pPr>
-        <w:numPr>
-          <w:ilvl w:val="0"/>
-          <w:numId w:val="1007"/>
-        </w:numPr>
-        <w:pStyle w:val="Compact"/>
-      </w:pPr>
-      <w:r>
-        <w:t xml:space="preserve">Link do grupo VIP do WhatsApp (vira QR code no e-book).</w:t>
-      </w:r>
-    </w:p>
-    <w:p>
-      <w:pPr>
-        <w:numPr>
-          <w:ilvl w:val="0"/>
-          <w:numId w:val="1007"/>
-        </w:numPr>
-        <w:pStyle w:val="Compact"/>
-      </w:pPr>
-      <w:r>
-        <w:t xml:space="preserve">Links de entrega do PDF e do Word (ou deixo para a plataforma entregar).</w:t>
-      </w:r>
-    </w:p>
-    <w:p>
-      <w:pPr>
-        <w:numPr>
-          <w:ilvl w:val="0"/>
-          <w:numId w:val="1007"/>
-        </w:numPr>
-        <w:pStyle w:val="Compact"/>
-      </w:pPr>
-      <w:r>
-        <w:t xml:space="preserve">Dossiê avulso: preço, ou se vai ser grátis para captar contatos.</w:t>
-      </w:r>
-    </w:p>
-    <w:p>
-      <w:pPr>
-        <w:numPr>
-          <w:ilvl w:val="0"/>
-          <w:numId w:val="1007"/>
-        </w:numPr>
-        <w:pStyle w:val="Compact"/>
-      </w:pPr>
-      <w:r>
-        <w:t xml:space="preserve">Você tem direito de uso da foto real do ato? Se sim, mande o arquivo original.</w:t>
-      </w:r>
-    </w:p>
-    <w:bookmarkEnd w:id="26"/>
-    <w:bookmarkStart w:id="27" w:name="X3df7c20d49ca095d3cb732bcab9917d8ce05854"/>
-    <w:p>
-      <w:pPr>
-        <w:pStyle w:val="Heading1"/>
-      </w:pPr>
-      <w:r>
-        <w:t xml:space="preserve">8. Conferir antes de publicar (não precisa me mandar nada)</w:t>
-      </w:r>
-    </w:p>
-    <w:p>
-      <w:pPr>
-        <w:numPr>
-          <w:ilvl w:val="0"/>
-          <w:numId w:val="1008"/>
-        </w:numPr>
-        <w:pStyle w:val="Compact"/>
-      </w:pPr>
-      <w:r>
-        <w:t xml:space="preserve">Abrir os 19 links do Dossiê e avisar se algum não abrir. A rede desta sessão bloqueia esses sites.</w:t>
-      </w:r>
-    </w:p>
-    <w:bookmarkEnd w:id="27"/>
+        <w:t xml:space="preserve">Direito de uso da foto real do ato, se quiser usá-la em alguma peça.</w:t>
+      </w:r>
+    </w:p>
+    <w:bookmarkEnd w:id="21"/>
     <w:sectPr/>
   </w:body>
 </w:document>
@@ -688,516 +557,6 @@
     </w:lvl>
     <w:lvl w:ilvl="8">
       <w:start w:val="1"/>
-      <w:numFmt w:val="decimal"/>
-      <w:lvlText w:val="%9."/>
-      <w:lvlJc w:val="left"/>
-      <w:pPr>
-        <w:ind w:left="6480" w:hanging="480"/>
-      </w:pPr>
-    </w:lvl>
-  </w:abstractNum>
-  <w:abstractNum w:abstractNumId="99414">
-    <w:nsid w:val="A99414"/>
-    <w:multiLevelType w:val="multilevel"/>
-    <w:lvl w:ilvl="0">
-      <w:start w:val="4"/>
-      <w:numFmt w:val="decimal"/>
-      <w:lvlText w:val="%1."/>
-      <w:lvlJc w:val="left"/>
-      <w:pPr>
-        <w:ind w:left="720" w:hanging="480"/>
-      </w:pPr>
-    </w:lvl>
-    <w:lvl w:ilvl="1">
-      <w:start w:val="4"/>
-      <w:numFmt w:val="decimal"/>
-      <w:lvlText w:val="%2."/>
-      <w:lvlJc w:val="left"/>
-      <w:pPr>
-        <w:ind w:left="1440" w:hanging="480"/>
-      </w:pPr>
-    </w:lvl>
-    <w:lvl w:ilvl="2">
-      <w:start w:val="4"/>
-      <w:numFmt w:val="decimal"/>
-      <w:lvlText w:val="%3."/>
-      <w:lvlJc w:val="left"/>
-      <w:pPr>
-        <w:ind w:left="2160" w:hanging="480"/>
-      </w:pPr>
-    </w:lvl>
-    <w:lvl w:ilvl="3">
-      <w:start w:val="4"/>
-      <w:numFmt w:val="decimal"/>
-      <w:lvlText w:val="%4."/>
-      <w:lvlJc w:val="left"/>
-      <w:pPr>
-        <w:ind w:left="2880" w:hanging="480"/>
-      </w:pPr>
-    </w:lvl>
-    <w:lvl w:ilvl="4">
-      <w:start w:val="4"/>
-      <w:numFmt w:val="decimal"/>
-      <w:lvlText w:val="%5."/>
-      <w:lvlJc w:val="left"/>
-      <w:pPr>
-        <w:ind w:left="3600" w:hanging="480"/>
-      </w:pPr>
-    </w:lvl>
-    <w:lvl w:ilvl="5">
-      <w:start w:val="4"/>
-      <w:numFmt w:val="decimal"/>
-      <w:lvlText w:val="%6."/>
-      <w:lvlJc w:val="left"/>
-      <w:pPr>
-        <w:ind w:left="4320" w:hanging="480"/>
-      </w:pPr>
-    </w:lvl>
-    <w:lvl w:ilvl="6">
-      <w:start w:val="4"/>
-      <w:numFmt w:val="decimal"/>
-      <w:lvlText w:val="%7."/>
-      <w:lvlJc w:val="left"/>
-      <w:pPr>
-        <w:ind w:left="5040" w:hanging="480"/>
-      </w:pPr>
-    </w:lvl>
-    <w:lvl w:ilvl="7">
-      <w:start w:val="4"/>
-      <w:numFmt w:val="decimal"/>
-      <w:lvlText w:val="%8."/>
-      <w:lvlJc w:val="left"/>
-      <w:pPr>
-        <w:ind w:left="5760" w:hanging="480"/>
-      </w:pPr>
-    </w:lvl>
-    <w:lvl w:ilvl="8">
-      <w:start w:val="4"/>
-      <w:numFmt w:val="decimal"/>
-      <w:lvlText w:val="%9."/>
-      <w:lvlJc w:val="left"/>
-      <w:pPr>
-        <w:ind w:left="6480" w:hanging="480"/>
-      </w:pPr>
-    </w:lvl>
-  </w:abstractNum>
-  <w:abstractNum w:abstractNumId="994111">
-    <w:nsid w:val="A994111"/>
-    <w:multiLevelType w:val="multilevel"/>
-    <w:lvl w:ilvl="0">
-      <w:start w:val="11"/>
-      <w:numFmt w:val="decimal"/>
-      <w:lvlText w:val="%1."/>
-      <w:lvlJc w:val="left"/>
-      <w:pPr>
-        <w:ind w:left="720" w:hanging="480"/>
-      </w:pPr>
-    </w:lvl>
-    <w:lvl w:ilvl="1">
-      <w:start w:val="11"/>
-      <w:numFmt w:val="decimal"/>
-      <w:lvlText w:val="%2."/>
-      <w:lvlJc w:val="left"/>
-      <w:pPr>
-        <w:ind w:left="1440" w:hanging="480"/>
-      </w:pPr>
-    </w:lvl>
-    <w:lvl w:ilvl="2">
-      <w:start w:val="11"/>
-      <w:numFmt w:val="decimal"/>
-      <w:lvlText w:val="%3."/>
-      <w:lvlJc w:val="left"/>
-      <w:pPr>
-        <w:ind w:left="2160" w:hanging="480"/>
-      </w:pPr>
-    </w:lvl>
-    <w:lvl w:ilvl="3">
-      <w:start w:val="11"/>
-      <w:numFmt w:val="decimal"/>
-      <w:lvlText w:val="%4."/>
-      <w:lvlJc w:val="left"/>
-      <w:pPr>
-        <w:ind w:left="2880" w:hanging="480"/>
-      </w:pPr>
-    </w:lvl>
-    <w:lvl w:ilvl="4">
-      <w:start w:val="11"/>
-      <w:numFmt w:val="decimal"/>
-      <w:lvlText w:val="%5."/>
-      <w:lvlJc w:val="left"/>
-      <w:pPr>
-        <w:ind w:left="3600" w:hanging="480"/>
-      </w:pPr>
-    </w:lvl>
-    <w:lvl w:ilvl="5">
-      <w:start w:val="11"/>
-      <w:numFmt w:val="decimal"/>
-      <w:lvlText w:val="%6."/>
-      <w:lvlJc w:val="left"/>
-      <w:pPr>
-        <w:ind w:left="4320" w:hanging="480"/>
-      </w:pPr>
-    </w:lvl>
-    <w:lvl w:ilvl="6">
-      <w:start w:val="11"/>
-      <w:numFmt w:val="decimal"/>
-      <w:lvlText w:val="%7."/>
-      <w:lvlJc w:val="left"/>
-      <w:pPr>
-        <w:ind w:left="5040" w:hanging="480"/>
-      </w:pPr>
-    </w:lvl>
-    <w:lvl w:ilvl="7">
-      <w:start w:val="11"/>
-      <w:numFmt w:val="decimal"/>
-      <w:lvlText w:val="%8."/>
-      <w:lvlJc w:val="left"/>
-      <w:pPr>
-        <w:ind w:left="5760" w:hanging="480"/>
-      </w:pPr>
-    </w:lvl>
-    <w:lvl w:ilvl="8">
-      <w:start w:val="11"/>
-      <w:numFmt w:val="decimal"/>
-      <w:lvlText w:val="%9."/>
-      <w:lvlJc w:val="left"/>
-      <w:pPr>
-        <w:ind w:left="6480" w:hanging="480"/>
-      </w:pPr>
-    </w:lvl>
-  </w:abstractNum>
-  <w:abstractNum w:abstractNumId="994112">
-    <w:nsid w:val="A994112"/>
-    <w:multiLevelType w:val="multilevel"/>
-    <w:lvl w:ilvl="0">
-      <w:start w:val="12"/>
-      <w:numFmt w:val="decimal"/>
-      <w:lvlText w:val="%1."/>
-      <w:lvlJc w:val="left"/>
-      <w:pPr>
-        <w:ind w:left="720" w:hanging="480"/>
-      </w:pPr>
-    </w:lvl>
-    <w:lvl w:ilvl="1">
-      <w:start w:val="12"/>
-      <w:numFmt w:val="decimal"/>
-      <w:lvlText w:val="%2."/>
-      <w:lvlJc w:val="left"/>
-      <w:pPr>
-        <w:ind w:left="1440" w:hanging="480"/>
-      </w:pPr>
-    </w:lvl>
-    <w:lvl w:ilvl="2">
-      <w:start w:val="12"/>
-      <w:numFmt w:val="decimal"/>
-      <w:lvlText w:val="%3."/>
-      <w:lvlJc w:val="left"/>
-      <w:pPr>
-        <w:ind w:left="2160" w:hanging="480"/>
-      </w:pPr>
-    </w:lvl>
-    <w:lvl w:ilvl="3">
-      <w:start w:val="12"/>
-      <w:numFmt w:val="decimal"/>
-      <w:lvlText w:val="%4."/>
-      <w:lvlJc w:val="left"/>
-      <w:pPr>
-        <w:ind w:left="2880" w:hanging="480"/>
-      </w:pPr>
-    </w:lvl>
-    <w:lvl w:ilvl="4">
-      <w:start w:val="12"/>
-      <w:numFmt w:val="decimal"/>
-      <w:lvlText w:val="%5."/>
-      <w:lvlJc w:val="left"/>
-      <w:pPr>
-        <w:ind w:left="3600" w:hanging="480"/>
-      </w:pPr>
-    </w:lvl>
-    <w:lvl w:ilvl="5">
-      <w:start w:val="12"/>
-      <w:numFmt w:val="decimal"/>
-      <w:lvlText w:val="%6."/>
-      <w:lvlJc w:val="left"/>
-      <w:pPr>
-        <w:ind w:left="4320" w:hanging="480"/>
-      </w:pPr>
-    </w:lvl>
-    <w:lvl w:ilvl="6">
-      <w:start w:val="12"/>
-      <w:numFmt w:val="decimal"/>
-      <w:lvlText w:val="%7."/>
-      <w:lvlJc w:val="left"/>
-      <w:pPr>
-        <w:ind w:left="5040" w:hanging="480"/>
-      </w:pPr>
-    </w:lvl>
-    <w:lvl w:ilvl="7">
-      <w:start w:val="12"/>
-      <w:numFmt w:val="decimal"/>
-      <w:lvlText w:val="%8."/>
-      <w:lvlJc w:val="left"/>
-      <w:pPr>
-        <w:ind w:left="5760" w:hanging="480"/>
-      </w:pPr>
-    </w:lvl>
-    <w:lvl w:ilvl="8">
-      <w:start w:val="12"/>
-      <w:numFmt w:val="decimal"/>
-      <w:lvlText w:val="%9."/>
-      <w:lvlJc w:val="left"/>
-      <w:pPr>
-        <w:ind w:left="6480" w:hanging="480"/>
-      </w:pPr>
-    </w:lvl>
-  </w:abstractNum>
-  <w:abstractNum w:abstractNumId="994115">
-    <w:nsid w:val="A994115"/>
-    <w:multiLevelType w:val="multilevel"/>
-    <w:lvl w:ilvl="0">
-      <w:start w:val="15"/>
-      <w:numFmt w:val="decimal"/>
-      <w:lvlText w:val="%1."/>
-      <w:lvlJc w:val="left"/>
-      <w:pPr>
-        <w:ind w:left="720" w:hanging="480"/>
-      </w:pPr>
-    </w:lvl>
-    <w:lvl w:ilvl="1">
-      <w:start w:val="15"/>
-      <w:numFmt w:val="decimal"/>
-      <w:lvlText w:val="%2."/>
-      <w:lvlJc w:val="left"/>
-      <w:pPr>
-        <w:ind w:left="1440" w:hanging="480"/>
-      </w:pPr>
-    </w:lvl>
-    <w:lvl w:ilvl="2">
-      <w:start w:val="15"/>
-      <w:numFmt w:val="decimal"/>
-      <w:lvlText w:val="%3."/>
-      <w:lvlJc w:val="left"/>
-      <w:pPr>
-        <w:ind w:left="2160" w:hanging="480"/>
-      </w:pPr>
-    </w:lvl>
-    <w:lvl w:ilvl="3">
-      <w:start w:val="15"/>
-      <w:numFmt w:val="decimal"/>
-      <w:lvlText w:val="%4."/>
-      <w:lvlJc w:val="left"/>
-      <w:pPr>
-        <w:ind w:left="2880" w:hanging="480"/>
-      </w:pPr>
-    </w:lvl>
-    <w:lvl w:ilvl="4">
-      <w:start w:val="15"/>
-      <w:numFmt w:val="decimal"/>
-      <w:lvlText w:val="%5."/>
-      <w:lvlJc w:val="left"/>
-      <w:pPr>
-        <w:ind w:left="3600" w:hanging="480"/>
-      </w:pPr>
-    </w:lvl>
-    <w:lvl w:ilvl="5">
-      <w:start w:val="15"/>
-      <w:numFmt w:val="decimal"/>
-      <w:lvlText w:val="%6."/>
-      <w:lvlJc w:val="left"/>
-      <w:pPr>
-        <w:ind w:left="4320" w:hanging="480"/>
-      </w:pPr>
-    </w:lvl>
-    <w:lvl w:ilvl="6">
-      <w:start w:val="15"/>
-      <w:numFmt w:val="decimal"/>
-      <w:lvlText w:val="%7."/>
-      <w:lvlJc w:val="left"/>
-      <w:pPr>
-        <w:ind w:left="5040" w:hanging="480"/>
-      </w:pPr>
-    </w:lvl>
-    <w:lvl w:ilvl="7">
-      <w:start w:val="15"/>
-      <w:numFmt w:val="decimal"/>
-      <w:lvlText w:val="%8."/>
-      <w:lvlJc w:val="left"/>
-      <w:pPr>
-        <w:ind w:left="5760" w:hanging="480"/>
-      </w:pPr>
-    </w:lvl>
-    <w:lvl w:ilvl="8">
-      <w:start w:val="15"/>
-      <w:numFmt w:val="decimal"/>
-      <w:lvlText w:val="%9."/>
-      <w:lvlJc w:val="left"/>
-      <w:pPr>
-        <w:ind w:left="6480" w:hanging="480"/>
-      </w:pPr>
-    </w:lvl>
-  </w:abstractNum>
-  <w:abstractNum w:abstractNumId="994119">
-    <w:nsid w:val="A994119"/>
-    <w:multiLevelType w:val="multilevel"/>
-    <w:lvl w:ilvl="0">
-      <w:start w:val="19"/>
-      <w:numFmt w:val="decimal"/>
-      <w:lvlText w:val="%1."/>
-      <w:lvlJc w:val="left"/>
-      <w:pPr>
-        <w:ind w:left="720" w:hanging="480"/>
-      </w:pPr>
-    </w:lvl>
-    <w:lvl w:ilvl="1">
-      <w:start w:val="19"/>
-      <w:numFmt w:val="decimal"/>
-      <w:lvlText w:val="%2."/>
-      <w:lvlJc w:val="left"/>
-      <w:pPr>
-        <w:ind w:left="1440" w:hanging="480"/>
-      </w:pPr>
-    </w:lvl>
-    <w:lvl w:ilvl="2">
-      <w:start w:val="19"/>
-      <w:numFmt w:val="decimal"/>
-      <w:lvlText w:val="%3."/>
-      <w:lvlJc w:val="left"/>
-      <w:pPr>
-        <w:ind w:left="2160" w:hanging="480"/>
-      </w:pPr>
-    </w:lvl>
-    <w:lvl w:ilvl="3">
-      <w:start w:val="19"/>
-      <w:numFmt w:val="decimal"/>
-      <w:lvlText w:val="%4."/>
-      <w:lvlJc w:val="left"/>
-      <w:pPr>
-        <w:ind w:left="2880" w:hanging="480"/>
-      </w:pPr>
-    </w:lvl>
-    <w:lvl w:ilvl="4">
-      <w:start w:val="19"/>
-      <w:numFmt w:val="decimal"/>
-      <w:lvlText w:val="%5."/>
-      <w:lvlJc w:val="left"/>
-      <w:pPr>
-        <w:ind w:left="3600" w:hanging="480"/>
-      </w:pPr>
-    </w:lvl>
-    <w:lvl w:ilvl="5">
-      <w:start w:val="19"/>
-      <w:numFmt w:val="decimal"/>
-      <w:lvlText w:val="%6."/>
-      <w:lvlJc w:val="left"/>
-      <w:pPr>
-        <w:ind w:left="4320" w:hanging="480"/>
-      </w:pPr>
-    </w:lvl>
-    <w:lvl w:ilvl="6">
-      <w:start w:val="19"/>
-      <w:numFmt w:val="decimal"/>
-      <w:lvlText w:val="%7."/>
-      <w:lvlJc w:val="left"/>
-      <w:pPr>
-        <w:ind w:left="5040" w:hanging="480"/>
-      </w:pPr>
-    </w:lvl>
-    <w:lvl w:ilvl="7">
-      <w:start w:val="19"/>
-      <w:numFmt w:val="decimal"/>
-      <w:lvlText w:val="%8."/>
-      <w:lvlJc w:val="left"/>
-      <w:pPr>
-        <w:ind w:left="5760" w:hanging="480"/>
-      </w:pPr>
-    </w:lvl>
-    <w:lvl w:ilvl="8">
-      <w:start w:val="19"/>
-      <w:numFmt w:val="decimal"/>
-      <w:lvlText w:val="%9."/>
-      <w:lvlJc w:val="left"/>
-      <w:pPr>
-        <w:ind w:left="6480" w:hanging="480"/>
-      </w:pPr>
-    </w:lvl>
-  </w:abstractNum>
-  <w:abstractNum w:abstractNumId="994122">
-    <w:nsid w:val="A994122"/>
-    <w:multiLevelType w:val="multilevel"/>
-    <w:lvl w:ilvl="0">
-      <w:start w:val="22"/>
-      <w:numFmt w:val="decimal"/>
-      <w:lvlText w:val="%1."/>
-      <w:lvlJc w:val="left"/>
-      <w:pPr>
-        <w:ind w:left="720" w:hanging="480"/>
-      </w:pPr>
-    </w:lvl>
-    <w:lvl w:ilvl="1">
-      <w:start w:val="22"/>
-      <w:numFmt w:val="decimal"/>
-      <w:lvlText w:val="%2."/>
-      <w:lvlJc w:val="left"/>
-      <w:pPr>
-        <w:ind w:left="1440" w:hanging="480"/>
-      </w:pPr>
-    </w:lvl>
-    <w:lvl w:ilvl="2">
-      <w:start w:val="22"/>
-      <w:numFmt w:val="decimal"/>
-      <w:lvlText w:val="%3."/>
-      <w:lvlJc w:val="left"/>
-      <w:pPr>
-        <w:ind w:left="2160" w:hanging="480"/>
-      </w:pPr>
-    </w:lvl>
-    <w:lvl w:ilvl="3">
-      <w:start w:val="22"/>
-      <w:numFmt w:val="decimal"/>
-      <w:lvlText w:val="%4."/>
-      <w:lvlJc w:val="left"/>
-      <w:pPr>
-        <w:ind w:left="2880" w:hanging="480"/>
-      </w:pPr>
-    </w:lvl>
-    <w:lvl w:ilvl="4">
-      <w:start w:val="22"/>
-      <w:numFmt w:val="decimal"/>
-      <w:lvlText w:val="%5."/>
-      <w:lvlJc w:val="left"/>
-      <w:pPr>
-        <w:ind w:left="3600" w:hanging="480"/>
-      </w:pPr>
-    </w:lvl>
-    <w:lvl w:ilvl="5">
-      <w:start w:val="22"/>
-      <w:numFmt w:val="decimal"/>
-      <w:lvlText w:val="%6."/>
-      <w:lvlJc w:val="left"/>
-      <w:pPr>
-        <w:ind w:left="4320" w:hanging="480"/>
-      </w:pPr>
-    </w:lvl>
-    <w:lvl w:ilvl="6">
-      <w:start w:val="22"/>
-      <w:numFmt w:val="decimal"/>
-      <w:lvlText w:val="%7."/>
-      <w:lvlJc w:val="left"/>
-      <w:pPr>
-        <w:ind w:left="5040" w:hanging="480"/>
-      </w:pPr>
-    </w:lvl>
-    <w:lvl w:ilvl="7">
-      <w:start w:val="22"/>
-      <w:numFmt w:val="decimal"/>
-      <w:lvlText w:val="%8."/>
-      <w:lvlJc w:val="left"/>
-      <w:pPr>
-        <w:ind w:left="5760" w:hanging="480"/>
-      </w:pPr>
-    </w:lvl>
-    <w:lvl w:ilvl="8">
-      <w:start w:val="22"/>
       <w:numFmt w:val="decimal"/>
       <w:lvlText w:val="%9."/>
       <w:lvlJc w:val="left"/>
@@ -1316,186 +675,6 @@
     </w:lvlOverride>
   </w:num>
   <w:num w:numId="1002">
-    <w:abstractNumId w:val="99414"/>
-    <w:lvlOverride w:ilvl="0">
-      <w:startOverride w:val="4"/>
-    </w:lvlOverride>
-    <w:lvlOverride w:ilvl="1">
-      <w:startOverride w:val="4"/>
-    </w:lvlOverride>
-    <w:lvlOverride w:ilvl="2">
-      <w:startOverride w:val="4"/>
-    </w:lvlOverride>
-    <w:lvlOverride w:ilvl="3">
-      <w:startOverride w:val="4"/>
-    </w:lvlOverride>
-    <w:lvlOverride w:ilvl="4">
-      <w:startOverride w:val="4"/>
-    </w:lvlOverride>
-    <w:lvlOverride w:ilvl="5">
-      <w:startOverride w:val="4"/>
-    </w:lvlOverride>
-    <w:lvlOverride w:ilvl="6">
-      <w:startOverride w:val="4"/>
-    </w:lvlOverride>
-    <w:lvlOverride w:ilvl="7">
-      <w:startOverride w:val="4"/>
-    </w:lvlOverride>
-    <w:lvlOverride w:ilvl="8">
-      <w:startOverride w:val="4"/>
-    </w:lvlOverride>
-  </w:num>
-  <w:num w:numId="1003">
-    <w:abstractNumId w:val="994111"/>
-    <w:lvlOverride w:ilvl="0">
-      <w:startOverride w:val="11"/>
-    </w:lvlOverride>
-    <w:lvlOverride w:ilvl="1">
-      <w:startOverride w:val="11"/>
-    </w:lvlOverride>
-    <w:lvlOverride w:ilvl="2">
-      <w:startOverride w:val="11"/>
-    </w:lvlOverride>
-    <w:lvlOverride w:ilvl="3">
-      <w:startOverride w:val="11"/>
-    </w:lvlOverride>
-    <w:lvlOverride w:ilvl="4">
-      <w:startOverride w:val="11"/>
-    </w:lvlOverride>
-    <w:lvlOverride w:ilvl="5">
-      <w:startOverride w:val="11"/>
-    </w:lvlOverride>
-    <w:lvlOverride w:ilvl="6">
-      <w:startOverride w:val="11"/>
-    </w:lvlOverride>
-    <w:lvlOverride w:ilvl="7">
-      <w:startOverride w:val="11"/>
-    </w:lvlOverride>
-    <w:lvlOverride w:ilvl="8">
-      <w:startOverride w:val="11"/>
-    </w:lvlOverride>
-  </w:num>
-  <w:num w:numId="1004">
-    <w:abstractNumId w:val="994112"/>
-    <w:lvlOverride w:ilvl="0">
-      <w:startOverride w:val="12"/>
-    </w:lvlOverride>
-    <w:lvlOverride w:ilvl="1">
-      <w:startOverride w:val="12"/>
-    </w:lvlOverride>
-    <w:lvlOverride w:ilvl="2">
-      <w:startOverride w:val="12"/>
-    </w:lvlOverride>
-    <w:lvlOverride w:ilvl="3">
-      <w:startOverride w:val="12"/>
-    </w:lvlOverride>
-    <w:lvlOverride w:ilvl="4">
-      <w:startOverride w:val="12"/>
-    </w:lvlOverride>
-    <w:lvlOverride w:ilvl="5">
-      <w:startOverride w:val="12"/>
-    </w:lvlOverride>
-    <w:lvlOverride w:ilvl="6">
-      <w:startOverride w:val="12"/>
-    </w:lvlOverride>
-    <w:lvlOverride w:ilvl="7">
-      <w:startOverride w:val="12"/>
-    </w:lvlOverride>
-    <w:lvlOverride w:ilvl="8">
-      <w:startOverride w:val="12"/>
-    </w:lvlOverride>
-  </w:num>
-  <w:num w:numId="1005">
-    <w:abstractNumId w:val="994115"/>
-    <w:lvlOverride w:ilvl="0">
-      <w:startOverride w:val="15"/>
-    </w:lvlOverride>
-    <w:lvlOverride w:ilvl="1">
-      <w:startOverride w:val="15"/>
-    </w:lvlOverride>
-    <w:lvlOverride w:ilvl="2">
-      <w:startOverride w:val="15"/>
-    </w:lvlOverride>
-    <w:lvlOverride w:ilvl="3">
-      <w:startOverride w:val="15"/>
-    </w:lvlOverride>
-    <w:lvlOverride w:ilvl="4">
-      <w:startOverride w:val="15"/>
-    </w:lvlOverride>
-    <w:lvlOverride w:ilvl="5">
-      <w:startOverride w:val="15"/>
-    </w:lvlOverride>
-    <w:lvlOverride w:ilvl="6">
-      <w:startOverride w:val="15"/>
-    </w:lvlOverride>
-    <w:lvlOverride w:ilvl="7">
-      <w:startOverride w:val="15"/>
-    </w:lvlOverride>
-    <w:lvlOverride w:ilvl="8">
-      <w:startOverride w:val="15"/>
-    </w:lvlOverride>
-  </w:num>
-  <w:num w:numId="1006">
-    <w:abstractNumId w:val="994119"/>
-    <w:lvlOverride w:ilvl="0">
-      <w:startOverride w:val="19"/>
-    </w:lvlOverride>
-    <w:lvlOverride w:ilvl="1">
-      <w:startOverride w:val="19"/>
-    </w:lvlOverride>
-    <w:lvlOverride w:ilvl="2">
-      <w:startOverride w:val="19"/>
-    </w:lvlOverride>
-    <w:lvlOverride w:ilvl="3">
-      <w:startOverride w:val="19"/>
-    </w:lvlOverride>
-    <w:lvlOverride w:ilvl="4">
-      <w:startOverride w:val="19"/>
-    </w:lvlOverride>
-    <w:lvlOverride w:ilvl="5">
-      <w:startOverride w:val="19"/>
-    </w:lvlOverride>
-    <w:lvlOverride w:ilvl="6">
-      <w:startOverride w:val="19"/>
-    </w:lvlOverride>
-    <w:lvlOverride w:ilvl="7">
-      <w:startOverride w:val="19"/>
-    </w:lvlOverride>
-    <w:lvlOverride w:ilvl="8">
-      <w:startOverride w:val="19"/>
-    </w:lvlOverride>
-  </w:num>
-  <w:num w:numId="1007">
-    <w:abstractNumId w:val="994122"/>
-    <w:lvlOverride w:ilvl="0">
-      <w:startOverride w:val="22"/>
-    </w:lvlOverride>
-    <w:lvlOverride w:ilvl="1">
-      <w:startOverride w:val="22"/>
-    </w:lvlOverride>
-    <w:lvlOverride w:ilvl="2">
-      <w:startOverride w:val="22"/>
-    </w:lvlOverride>
-    <w:lvlOverride w:ilvl="3">
-      <w:startOverride w:val="22"/>
-    </w:lvlOverride>
-    <w:lvlOverride w:ilvl="4">
-      <w:startOverride w:val="22"/>
-    </w:lvlOverride>
-    <w:lvlOverride w:ilvl="5">
-      <w:startOverride w:val="22"/>
-    </w:lvlOverride>
-    <w:lvlOverride w:ilvl="6">
-      <w:startOverride w:val="22"/>
-    </w:lvlOverride>
-    <w:lvlOverride w:ilvl="7">
-      <w:startOverride w:val="22"/>
-    </w:lvlOverride>
-    <w:lvlOverride w:ilvl="8">
-      <w:startOverride w:val="22"/>
-    </w:lvlOverride>
-  </w:num>
-  <w:num w:numId="1008">
     <w:abstractNumId w:val="991"/>
   </w:num>
 </w:numbering>

</xml_diff>

<commit_message>
Dados do autor: 2,5 anos, saúde, escolas, lazer, Binance/Bybit, residência e banco; remove ganho com câmbio e comparador vazio
Co-Authored-By: Claude Opus 5.5 <noreply@anthropic.com>
Claude-Session: https://claude.ai/code/session_01GJhkYfDrHd3AkmDKDTo71F
</commit_message>
<xml_diff>
--- a/curso/dist/Pendencias-do-Autor.docx
+++ b/curso/dist/Pendencias-do-Autor.docx
@@ -89,7 +89,7 @@
         <w:pStyle w:val="FirstParagraph"/>
       </w:pPr>
       <w:r>
-        <w:t xml:space="preserve">O e-book está fechado e pode ser publicado. O que você não mandou saiu do texto, sem deixar buraco.</w:t>
+        <w:t xml:space="preserve">Recebido e já no e-book (30/10/2026): 2 anos e meio na Bolívia, academia e cinema, psiquiatra e psicólogo, escolas, Binance/Bybit, residência fácil, conta no Banco Económico em 20 minutos, igrejas e comunidade brasileira. A página de ganho com câmbio saiu. O contrato de aluguel não entra (a prova são os anúncios públicos).</w:t>
       </w:r>
     </w:p>
     <w:bookmarkStart w:id="20" w:name="obrigatório-antes-de-vender"/>
@@ -114,13 +114,13 @@
           <w:bCs/>
           <w:b/>
         </w:rPr>
-        <w:t xml:space="preserve">Link do grupo VIP do WhatsApp:</w:t>
-      </w:r>
-      <w:r>
-        <w:t xml:space="preserve"> </w:t>
-      </w:r>
-      <w:r>
-        <w:t xml:space="preserve">vira o QR code da página</w:t>
+        <w:t xml:space="preserve">Link do grupo VIP do WhatsApp</w:t>
+      </w:r>
+      <w:r>
+        <w:t xml:space="preserve"> </w:t>
+      </w:r>
+      <w:r>
+        <w:t xml:space="preserve">(vira o QR code da página</w:t>
       </w:r>
       <w:r>
         <w:t xml:space="preserve"> </w:t>
@@ -135,10 +135,7 @@
         <w:t xml:space="preserve">”</w:t>
       </w:r>
       <w:r>
-        <w:t xml:space="preserve"> </w:t>
-      </w:r>
-      <w:r>
-        <w:t xml:space="preserve">(hoje é um quadro tracejado).</w:t>
+        <w:t xml:space="preserve">).</w:t>
       </w:r>
     </w:p>
     <w:p>
@@ -154,31 +151,13 @@
           <w:bCs/>
           <w:b/>
         </w:rPr>
-        <w:t xml:space="preserve">Link da página de vendas ou do checkout:</w:t>
-      </w:r>
-      <w:r>
-        <w:t xml:space="preserve"> </w:t>
-      </w:r>
-      <w:r>
-        <w:t xml:space="preserve">entra no guia</w:t>
-      </w:r>
-      <w:r>
-        <w:t xml:space="preserve"> </w:t>
-      </w:r>
-      <w:r>
-        <w:t xml:space="preserve">“</w:t>
-      </w:r>
-      <w:r>
-        <w:t xml:space="preserve">Como convencer um petista</w:t>
-      </w:r>
-      <w:r>
-        <w:t xml:space="preserve">”</w:t>
-      </w:r>
-      <w:r>
-        <w:t xml:space="preserve"> </w:t>
-      </w:r>
-      <w:r>
-        <w:t xml:space="preserve">(página de WhatsApp e contracapa) e nos botões da página de vendas.</w:t>
+        <w:t xml:space="preserve">Link do checkout</w:t>
+      </w:r>
+      <w:r>
+        <w:t xml:space="preserve"> </w:t>
+      </w:r>
+      <w:r>
+        <w:t xml:space="preserve">(botões da página de vendas e brinde).</w:t>
       </w:r>
     </w:p>
     <w:p>
@@ -194,73 +173,23 @@
           <w:bCs/>
           <w:b/>
         </w:rPr>
-        <w:t xml:space="preserve">O guia</w:t>
-      </w:r>
-      <w:r>
-        <w:rPr>
-          <w:bCs/>
-          <w:b/>
-        </w:rPr>
-        <w:t xml:space="preserve"> </w:t>
-      </w:r>
-      <w:r>
-        <w:rPr>
-          <w:bCs/>
-          <w:b/>
-        </w:rPr>
-        <w:t xml:space="preserve">“</w:t>
-      </w:r>
-      <w:r>
-        <w:rPr>
-          <w:bCs/>
-          <w:b/>
-        </w:rPr>
-        <w:t xml:space="preserve">Como convencer um petista</w:t>
-      </w:r>
-      <w:r>
-        <w:rPr>
-          <w:bCs/>
-          <w:b/>
-        </w:rPr>
-        <w:t xml:space="preserve">”</w:t>
-      </w:r>
-      <w:r>
-        <w:t xml:space="preserve"> </w:t>
-      </w:r>
-      <w:r>
-        <w:t xml:space="preserve">fica só como brinde de quem compra, ou também como isca grátis?</w:t>
-      </w:r>
-    </w:p>
-    <w:p>
-      <w:pPr>
-        <w:numPr>
-          <w:ilvl w:val="0"/>
-          <w:numId w:val="1001"/>
-        </w:numPr>
-        <w:pStyle w:val="Compact"/>
-      </w:pPr>
-      <w:r>
-        <w:rPr>
-          <w:bCs/>
-          <w:b/>
-        </w:rPr>
         <w:t xml:space="preserve">Abrir os 19 links do dossiê</w:t>
       </w:r>
       <w:r>
         <w:t xml:space="preserve"> </w:t>
       </w:r>
       <w:r>
-        <w:t xml:space="preserve">(dentro do guia) e avisar se algum não abrir.</w:t>
+        <w:t xml:space="preserve">e avisar se algum não abrir.</w:t>
       </w:r>
     </w:p>
     <w:bookmarkEnd w:id="20"/>
-    <w:bookmarkStart w:id="21" w:name="Xc718446c34a81582c892764d655ad24b91b5214"/>
+    <w:bookmarkStart w:id="21" w:name="opcional"/>
     <w:p>
       <w:pPr>
         <w:pStyle w:val="Heading1"/>
       </w:pPr>
       <w:r>
-        <w:t xml:space="preserve">Opcional (deixa o livro mais forte; cada item volta para o capítulo indicado)</w:t>
+        <w:t xml:space="preserve">Opcional</w:t>
       </w:r>
     </w:p>
     <w:p>
@@ -272,7 +201,23 @@
         <w:pStyle w:val="Compact"/>
       </w:pPr>
       <w:r>
-        <w:t xml:space="preserve">Há quanto tempo mora na Bolívia; o que surpreendeu, o que foi difícil, o que faria diferente (7.13).</w:t>
+        <w:t xml:space="preserve">Anúncios de imóveis</w:t>
+      </w:r>
+      <w:r>
+        <w:t xml:space="preserve"> </w:t>
+      </w:r>
+      <w:r>
+        <w:rPr>
+          <w:bCs/>
+          <w:b/>
+        </w:rPr>
+        <w:t xml:space="preserve">à venda</w:t>
+      </w:r>
+      <w:r>
+        <w:t xml:space="preserve"> </w:t>
+      </w:r>
+      <w:r>
+        <w:t xml:space="preserve">em Cochabamba (os prints que chegaram eram só de aluguel).</w:t>
       </w:r>
     </w:p>
     <w:p>
@@ -284,7 +229,7 @@
         <w:pStyle w:val="Compact"/>
       </w:pPr>
       <w:r>
-        <w:t xml:space="preserve">Foto do contrato ou recibo do aluguel, com dados borrados (2.5).</w:t>
+        <w:t xml:space="preserve">O que mais te surpreendeu, o que foi difícil e o que faria diferente (depoimento 7.13).</w:t>
       </w:r>
     </w:p>
     <w:p>
@@ -296,130 +241,7 @@
         <w:pStyle w:val="Compact"/>
       </w:pPr>
       <w:r>
-        <w:t xml:space="preserve">Anúncios reais de imóveis à venda e de aluguel (2.2 e 2.3).</w:t>
-      </w:r>
-    </w:p>
-    <w:p>
-      <w:pPr>
-        <w:numPr>
-          <w:ilvl w:val="0"/>
-          <w:numId w:val="1002"/>
-        </w:numPr>
-        <w:pStyle w:val="Compact"/>
-      </w:pPr>
-      <w:r>
-        <w:t xml:space="preserve">5 pares de anúncios de carro Brasil × Bolívia (2.4; hoje é uma tabela para o leitor preencher).</w:t>
-      </w:r>
-    </w:p>
-    <w:p>
-      <w:pPr>
-        <w:numPr>
-          <w:ilvl w:val="0"/>
-          <w:numId w:val="1002"/>
-        </w:numPr>
-        <w:pStyle w:val="Compact"/>
-      </w:pPr>
-      <w:r>
-        <w:t xml:space="preserve">Gastos com academia e cinema; orçamento de família com 2 filhos (2.5 e 2.8).</w:t>
-      </w:r>
-    </w:p>
-    <w:p>
-      <w:pPr>
-        <w:numPr>
-          <w:ilvl w:val="0"/>
-          <w:numId w:val="1002"/>
-        </w:numPr>
-        <w:pStyle w:val="Compact"/>
-      </w:pPr>
-      <w:r>
-        <w:t xml:space="preserve">Clínicas em Cochabamba; preço de consulta, exames e seguro (2.6).</w:t>
-      </w:r>
-    </w:p>
-    <w:p>
-      <w:pPr>
-        <w:numPr>
-          <w:ilvl w:val="0"/>
-          <w:numId w:val="1002"/>
-        </w:numPr>
-        <w:pStyle w:val="Compact"/>
-      </w:pPr>
-      <w:r>
-        <w:t xml:space="preserve">Mensalidade de 2 ou 3 escolas (2.7).</w:t>
-      </w:r>
-    </w:p>
-    <w:p>
-      <w:pPr>
-        <w:numPr>
-          <w:ilvl w:val="0"/>
-          <w:numId w:val="1002"/>
-        </w:numPr>
-        <w:pStyle w:val="Compact"/>
-      </w:pPr>
-      <w:r>
-        <w:t xml:space="preserve">Rede que você usa para o USDT; exchange no Brasil, P2P na Bolívia e banco (3.5 e 4.5).</w:t>
-      </w:r>
-    </w:p>
-    <w:p>
-      <w:pPr>
-        <w:numPr>
-          <w:ilvl w:val="0"/>
-          <w:numId w:val="1002"/>
-        </w:numPr>
-        <w:pStyle w:val="Compact"/>
-      </w:pPr>
-      <w:r>
-        <w:t xml:space="preserve">Seu resultado com câmbio, com extratos borrados (volta a página</w:t>
-      </w:r>
-      <w:r>
-        <w:t xml:space="preserve"> </w:t>
-      </w:r>
-      <w:r>
-        <w:t xml:space="preserve">“</w:t>
-      </w:r>
-      <w:r>
-        <w:t xml:space="preserve">Como eu ganho com câmbio</w:t>
-      </w:r>
-      <w:r>
-        <w:t xml:space="preserve">”</w:t>
-      </w:r>
-      <w:r>
-        <w:t xml:space="preserve">, 4.18).</w:t>
-      </w:r>
-    </w:p>
-    <w:p>
-      <w:pPr>
-        <w:numPr>
-          <w:ilvl w:val="0"/>
-          <w:numId w:val="1002"/>
-        </w:numPr>
-        <w:pStyle w:val="Compact"/>
-      </w:pPr>
-      <w:r>
-        <w:t xml:space="preserve">Como foi a sua residência e a abertura de conta (7.4 e 7.7).</w:t>
-      </w:r>
-    </w:p>
-    <w:p>
-      <w:pPr>
-        <w:numPr>
-          <w:ilvl w:val="0"/>
-          <w:numId w:val="1002"/>
-        </w:numPr>
-        <w:pStyle w:val="Compact"/>
-      </w:pPr>
-      <w:r>
-        <w:t xml:space="preserve">Grupos e igrejas de brasileiros em Cochabamba (7.12).</w:t>
-      </w:r>
-    </w:p>
-    <w:p>
-      <w:pPr>
-        <w:numPr>
-          <w:ilvl w:val="0"/>
-          <w:numId w:val="1002"/>
-        </w:numPr>
-        <w:pStyle w:val="Compact"/>
-      </w:pPr>
-      <w:r>
-        <w:t xml:space="preserve">Direito de uso da foto real do ato, se quiser usá-la em alguma peça.</w:t>
+        <w:t xml:space="preserve">Orçamento de uma família com 2 filhos.</w:t>
       </w:r>
     </w:p>
     <w:bookmarkEnd w:id="21"/>

</xml_diff>